<commit_message>
docs: documentos dirigidos y maquetados por destinatario (Calidad, Servicio, Dirección, Informática)
Cuatro escritos en Word, cada uno con bloque de destinatario, contenido
adaptado al interlocutor y firma:
- 01 Comisión de Calidad · 02 Jefatura y secciones de Hematología
- 03 Dirección Médica · 04 Sistemas de Información (Informática)
Generados con el conversor reproducible md_to_docx.py (portada, pie con
numeración, texto justificado, tablas).
</commit_message>
<xml_diff>
--- a/docs/PROYECTO_HemoPocket.docx
+++ b/docs/PROYECTO_HemoPocket.docx
@@ -4,31 +4,35 @@
   <w:body>
     <w:p>
       <w:pPr>
-        <w:spacing w:after="120"/>
+        <w:spacing w:after="160"/>
+        <w:jc w:val="center"/>
       </w:pPr>
       <w:r>
         <w:rPr>
           <w:b/>
           <w:color w:val="C41E3A"/>
-          <w:sz w:val="40"/>
+          <w:sz w:val="38"/>
         </w:rPr>
         <w:t>Proyecto HemoPocket</w:t>
       </w:r>
     </w:p>
     <w:p>
       <w:pPr>
-        <w:spacing w:before="160"/>
+        <w:spacing w:before="140"/>
       </w:pPr>
       <w:r>
         <w:rPr>
           <w:b/>
           <w:color w:val="C41E3A"/>
-          <w:sz w:val="25"/>
+          <w:sz w:val="24"/>
         </w:rPr>
         <w:t>Herramienta de apoyo a la decisión clínica y unificación de criterios en Hematología y Hemoterapia</w:t>
       </w:r>
     </w:p>
     <w:p>
+      <w:pPr>
+        <w:jc w:val="both"/>
+      </w:pPr>
       <w:r>
         <w:rPr>
           <w:b/>
@@ -38,19 +42,25 @@
     </w:p>
     <w:tbl>
       <w:tblPr>
-        <w:tblStyle w:val="LightGrid-Accent1"/>
         <w:tblW w:type="auto" w:w="0"/>
-        <w:jc w:val="center"/>
         <w:tblLook w:firstColumn="1" w:firstRow="1" w:lastColumn="0" w:lastRow="0" w:noHBand="0" w:noVBand="1" w:val="04A0"/>
+        <w:tblBorders>
+          <w:top w:val="none"/>
+          <w:left w:val="none"/>
+          <w:bottom w:val="none"/>
+          <w:right w:val="none"/>
+          <w:insideH w:val="none"/>
+          <w:insideV w:val="none"/>
+        </w:tblBorders>
       </w:tblPr>
       <w:tblGrid>
-        <w:gridCol w:w="4320"/>
-        <w:gridCol w:w="4320"/>
+        <w:gridCol w:w="4680"/>
+        <w:gridCol w:w="4680"/>
       </w:tblGrid>
       <w:tr>
         <w:tc>
           <w:tcPr>
-            <w:tcW w:type="dxa" w:w="4320"/>
+            <w:tcW w:type="dxa" w:w="4680"/>
           </w:tcPr>
           <w:p>
             <w:r>
@@ -58,28 +68,6 @@
                 <w:b/>
               </w:rPr>
             </w:r>
-          </w:p>
-        </w:tc>
-        <w:tc>
-          <w:tcPr>
-            <w:tcW w:type="dxa" w:w="4320"/>
-          </w:tcPr>
-          <w:p>
-            <w:r>
-              <w:rPr>
-                <w:b/>
-              </w:rPr>
-            </w:r>
-          </w:p>
-        </w:tc>
-      </w:tr>
-      <w:tr>
-        <w:tc>
-          <w:tcPr>
-            <w:tcW w:type="dxa" w:w="4320"/>
-          </w:tcPr>
-          <w:p>
-            <w:r/>
             <w:r>
               <w:rPr>
                 <w:b/>
@@ -90,7 +78,7 @@
         </w:tc>
         <w:tc>
           <w:tcPr>
-            <w:tcW w:type="dxa" w:w="4320"/>
+            <w:tcW w:type="dxa" w:w="4680"/>
           </w:tcPr>
           <w:p>
             <w:r/>
@@ -103,10 +91,14 @@
       <w:tr>
         <w:tc>
           <w:tcPr>
-            <w:tcW w:type="dxa" w:w="4320"/>
+            <w:tcW w:type="dxa" w:w="4680"/>
           </w:tcPr>
           <w:p>
-            <w:r/>
+            <w:r>
+              <w:rPr>
+                <w:b/>
+              </w:rPr>
+            </w:r>
             <w:r>
               <w:rPr>
                 <w:b/>
@@ -117,7 +109,7 @@
         </w:tc>
         <w:tc>
           <w:tcPr>
-            <w:tcW w:type="dxa" w:w="4320"/>
+            <w:tcW w:type="dxa" w:w="4680"/>
           </w:tcPr>
           <w:p>
             <w:r/>
@@ -130,10 +122,14 @@
       <w:tr>
         <w:tc>
           <w:tcPr>
-            <w:tcW w:type="dxa" w:w="4320"/>
+            <w:tcW w:type="dxa" w:w="4680"/>
           </w:tcPr>
           <w:p>
-            <w:r/>
+            <w:r>
+              <w:rPr>
+                <w:b/>
+              </w:rPr>
+            </w:r>
             <w:r>
               <w:rPr>
                 <w:b/>
@@ -144,7 +140,7 @@
         </w:tc>
         <w:tc>
           <w:tcPr>
-            <w:tcW w:type="dxa" w:w="4320"/>
+            <w:tcW w:type="dxa" w:w="4680"/>
           </w:tcPr>
           <w:p>
             <w:r/>
@@ -157,10 +153,14 @@
       <w:tr>
         <w:tc>
           <w:tcPr>
-            <w:tcW w:type="dxa" w:w="4320"/>
+            <w:tcW w:type="dxa" w:w="4680"/>
           </w:tcPr>
           <w:p>
-            <w:r/>
+            <w:r>
+              <w:rPr>
+                <w:b/>
+              </w:rPr>
+            </w:r>
             <w:r>
               <w:rPr>
                 <w:b/>
@@ -171,7 +171,7 @@
         </w:tc>
         <w:tc>
           <w:tcPr>
-            <w:tcW w:type="dxa" w:w="4320"/>
+            <w:tcW w:type="dxa" w:w="4680"/>
           </w:tcPr>
           <w:p>
             <w:r/>
@@ -184,10 +184,14 @@
       <w:tr>
         <w:tc>
           <w:tcPr>
-            <w:tcW w:type="dxa" w:w="4320"/>
+            <w:tcW w:type="dxa" w:w="4680"/>
           </w:tcPr>
           <w:p>
-            <w:r/>
+            <w:r>
+              <w:rPr>
+                <w:b/>
+              </w:rPr>
+            </w:r>
             <w:r>
               <w:rPr>
                 <w:b/>
@@ -198,7 +202,7 @@
         </w:tc>
         <w:tc>
           <w:tcPr>
-            <w:tcW w:type="dxa" w:w="4320"/>
+            <w:tcW w:type="dxa" w:w="4680"/>
           </w:tcPr>
           <w:p>
             <w:r/>
@@ -211,10 +215,14 @@
       <w:tr>
         <w:tc>
           <w:tcPr>
-            <w:tcW w:type="dxa" w:w="4320"/>
+            <w:tcW w:type="dxa" w:w="4680"/>
           </w:tcPr>
           <w:p>
-            <w:r/>
+            <w:r>
+              <w:rPr>
+                <w:b/>
+              </w:rPr>
+            </w:r>
             <w:r>
               <w:rPr>
                 <w:b/>
@@ -225,7 +233,7 @@
         </w:tc>
         <w:tc>
           <w:tcPr>
-            <w:tcW w:type="dxa" w:w="4320"/>
+            <w:tcW w:type="dxa" w:w="4680"/>
           </w:tcPr>
           <w:p>
             <w:r/>
@@ -238,10 +246,14 @@
       <w:tr>
         <w:tc>
           <w:tcPr>
-            <w:tcW w:type="dxa" w:w="4320"/>
+            <w:tcW w:type="dxa" w:w="4680"/>
           </w:tcPr>
           <w:p>
-            <w:r/>
+            <w:r>
+              <w:rPr>
+                <w:b/>
+              </w:rPr>
+            </w:r>
             <w:r>
               <w:rPr>
                 <w:b/>
@@ -252,7 +264,7 @@
         </w:tc>
         <w:tc>
           <w:tcPr>
-            <w:tcW w:type="dxa" w:w="4320"/>
+            <w:tcW w:type="dxa" w:w="4680"/>
           </w:tcPr>
           <w:p>
             <w:r/>
@@ -359,13 +371,13 @@
     </w:p>
     <w:p>
       <w:pPr>
-        <w:spacing w:before="80" w:after="80"/>
+        <w:spacing w:before="60" w:after="60"/>
       </w:pPr>
       <w:r>
         <w:rPr>
-          <w:color w:val="CCCCCC"/>
+          <w:color w:val="BBBBBB"/>
         </w:rPr>
-        <w:t>__________________________________________________</w:t>
+        <w:t>____________________________________________________________</w:t>
       </w:r>
     </w:p>
     <w:p>
@@ -376,12 +388,15 @@
         <w:rPr>
           <w:b/>
           <w:color w:val="C41E3A"/>
-          <w:sz w:val="30"/>
+          <w:sz w:val="29"/>
         </w:rPr>
         <w:t>1. Resumen ejecutivo</w:t>
       </w:r>
     </w:p>
     <w:p>
+      <w:pPr>
+        <w:jc w:val="both"/>
+      </w:pPr>
       <w:r>
         <w:t xml:space="preserve">HemoPocket es una aplicación de consulta rápida diseñada por y para hematólogos, que reúne en un único punto de acceso, disponible incluso sin conexión, los </w:t>
       </w:r>
@@ -396,6 +411,9 @@
       </w:r>
     </w:p>
     <w:p>
+      <w:pPr>
+        <w:jc w:val="both"/>
+      </w:pPr>
       <w:r>
         <w:t xml:space="preserve">Su propósito es </w:t>
       </w:r>
@@ -428,6 +446,9 @@
       </w:r>
     </w:p>
     <w:p>
+      <w:pPr>
+        <w:jc w:val="both"/>
+      </w:pPr>
       <w:r>
         <w:t xml:space="preserve">La herramienta ya integra </w:t>
       </w:r>
@@ -487,19 +508,22 @@
       </w:r>
     </w:p>
     <w:p>
+      <w:pPr>
+        <w:jc w:val="both"/>
+      </w:pPr>
       <w:r>
         <w:t>Se solicita a las comisiones su revisión y, en su caso, el reconocimiento de HemoPocket como herramienta de apoyo del Servicio, con el modelo de gobernanza del contenido que se describe en este documento.</w:t>
       </w:r>
     </w:p>
     <w:p>
       <w:pPr>
-        <w:spacing w:before="80" w:after="80"/>
+        <w:spacing w:before="60" w:after="60"/>
       </w:pPr>
       <w:r>
         <w:rPr>
-          <w:color w:val="CCCCCC"/>
+          <w:color w:val="BBBBBB"/>
         </w:rPr>
-        <w:t>__________________________________________________</w:t>
+        <w:t>____________________________________________________________</w:t>
       </w:r>
     </w:p>
     <w:p>
@@ -510,12 +534,15 @@
         <w:rPr>
           <w:b/>
           <w:color w:val="C41E3A"/>
-          <w:sz w:val="30"/>
+          <w:sz w:val="29"/>
         </w:rPr>
         <w:t>2. Justificación y necesidad</w:t>
       </w:r>
     </w:p>
     <w:p>
+      <w:pPr>
+        <w:jc w:val="both"/>
+      </w:pPr>
       <w:r>
         <w:t>La Hematología clínica se caracteriza por:</w:t>
       </w:r>
@@ -563,6 +590,9 @@
       </w:r>
     </w:p>
     <w:p>
+      <w:pPr>
+        <w:jc w:val="both"/>
+      </w:pPr>
       <w:r>
         <w:t xml:space="preserve">En este contexto, la información clínica suele estar </w:t>
       </w:r>
@@ -586,6 +616,9 @@
       </w:r>
     </w:p>
     <w:p>
+      <w:pPr>
+        <w:jc w:val="both"/>
+      </w:pPr>
       <w:r>
         <w:rPr>
           <w:b/>
@@ -598,13 +631,13 @@
     </w:p>
     <w:p>
       <w:pPr>
-        <w:spacing w:before="80" w:after="80"/>
+        <w:spacing w:before="60" w:after="60"/>
       </w:pPr>
       <w:r>
         <w:rPr>
-          <w:color w:val="CCCCCC"/>
+          <w:color w:val="BBBBBB"/>
         </w:rPr>
-        <w:t>__________________________________________________</w:t>
+        <w:t>____________________________________________________________</w:t>
       </w:r>
     </w:p>
     <w:p>
@@ -615,20 +648,20 @@
         <w:rPr>
           <w:b/>
           <w:color w:val="C41E3A"/>
-          <w:sz w:val="30"/>
+          <w:sz w:val="29"/>
         </w:rPr>
         <w:t>3. Descripción de la herramienta</w:t>
       </w:r>
     </w:p>
     <w:p>
       <w:pPr>
-        <w:spacing w:before="160"/>
+        <w:spacing w:before="140"/>
       </w:pPr>
       <w:r>
         <w:rPr>
           <w:b/>
           <w:color w:val="C41E3A"/>
-          <w:sz w:val="25"/>
+          <w:sz w:val="24"/>
         </w:rPr>
         <w:t>3.1. Qué es, técnicamente</w:t>
       </w:r>
@@ -745,18 +778,21 @@
     </w:p>
     <w:p>
       <w:pPr>
-        <w:spacing w:before="160"/>
+        <w:spacing w:before="140"/>
       </w:pPr>
       <w:r>
         <w:rPr>
           <w:b/>
           <w:color w:val="C41E3A"/>
-          <w:sz w:val="25"/>
+          <w:sz w:val="24"/>
         </w:rPr>
         <w:t>3.2. Estructura del contenido</w:t>
       </w:r>
     </w:p>
     <w:p>
+      <w:pPr>
+        <w:jc w:val="both"/>
+      </w:pPr>
       <w:r>
         <w:t xml:space="preserve">La aplicación se organiza por </w:t>
       </w:r>
@@ -970,6 +1006,9 @@
       </w:r>
     </w:p>
     <w:p>
+      <w:pPr>
+        <w:jc w:val="both"/>
+      </w:pPr>
       <w:r>
         <w:t xml:space="preserve">Cada escala y criterio incluye, cuando procede, su </w:t>
       </w:r>
@@ -985,13 +1024,13 @@
     </w:p>
     <w:p>
       <w:pPr>
-        <w:spacing w:before="80" w:after="80"/>
+        <w:spacing w:before="60" w:after="60"/>
       </w:pPr>
       <w:r>
         <w:rPr>
-          <w:color w:val="CCCCCC"/>
+          <w:color w:val="BBBBBB"/>
         </w:rPr>
-        <w:t>__________________________________________________</w:t>
+        <w:t>____________________________________________________________</w:t>
       </w:r>
     </w:p>
     <w:p>
@@ -1002,25 +1041,28 @@
         <w:rPr>
           <w:b/>
           <w:color w:val="C41E3A"/>
-          <w:sz w:val="30"/>
+          <w:sz w:val="29"/>
         </w:rPr>
         <w:t>4. Objetivos</w:t>
       </w:r>
     </w:p>
     <w:p>
       <w:pPr>
-        <w:spacing w:before="160"/>
+        <w:spacing w:before="140"/>
       </w:pPr>
       <w:r>
         <w:rPr>
           <w:b/>
           <w:color w:val="C41E3A"/>
-          <w:sz w:val="25"/>
+          <w:sz w:val="24"/>
         </w:rPr>
         <w:t>4.1. Objetivo general</w:t>
       </w:r>
     </w:p>
     <w:p>
+      <w:pPr>
+        <w:jc w:val="both"/>
+      </w:pPr>
       <w:r>
         <w:t xml:space="preserve">Disponer de una herramienta de apoyo a la decisión clínica, unificada y actualizada, que mejore la </w:t>
       </w:r>
@@ -1036,13 +1078,13 @@
     </w:p>
     <w:p>
       <w:pPr>
-        <w:spacing w:before="160"/>
+        <w:spacing w:before="140"/>
       </w:pPr>
       <w:r>
         <w:rPr>
           <w:b/>
           <w:color w:val="C41E3A"/>
-          <w:sz w:val="25"/>
+          <w:sz w:val="24"/>
         </w:rPr>
         <w:t>4.2. Objetivos específicos</w:t>
       </w:r>
@@ -1133,13 +1175,13 @@
     </w:p>
     <w:p>
       <w:pPr>
-        <w:spacing w:before="80" w:after="80"/>
+        <w:spacing w:before="60" w:after="60"/>
       </w:pPr>
       <w:r>
         <w:rPr>
-          <w:color w:val="CCCCCC"/>
+          <w:color w:val="BBBBBB"/>
         </w:rPr>
-        <w:t>__________________________________________________</w:t>
+        <w:t>____________________________________________________________</w:t>
       </w:r>
     </w:p>
     <w:p>
@@ -1150,7 +1192,7 @@
         <w:rPr>
           <w:b/>
           <w:color w:val="C41E3A"/>
-          <w:sz w:val="30"/>
+          <w:sz w:val="29"/>
         </w:rPr>
         <w:t>5. Aportación a la calidad asistencial y a la seguridad del paciente</w:t>
       </w:r>
@@ -1163,13 +1205,13 @@
         <w:tblLook w:firstColumn="1" w:firstRow="1" w:lastColumn="0" w:lastRow="0" w:noHBand="0" w:noVBand="1" w:val="04A0"/>
       </w:tblPr>
       <w:tblGrid>
-        <w:gridCol w:w="4320"/>
-        <w:gridCol w:w="4320"/>
+        <w:gridCol w:w="4680"/>
+        <w:gridCol w:w="4680"/>
       </w:tblGrid>
       <w:tr>
         <w:tc>
           <w:tcPr>
-            <w:tcW w:type="dxa" w:w="4320"/>
+            <w:tcW w:type="dxa" w:w="4680"/>
           </w:tcPr>
           <w:p>
             <w:r>
@@ -1187,7 +1229,7 @@
         </w:tc>
         <w:tc>
           <w:tcPr>
-            <w:tcW w:type="dxa" w:w="4320"/>
+            <w:tcW w:type="dxa" w:w="4680"/>
           </w:tcPr>
           <w:p>
             <w:r>
@@ -1207,7 +1249,7 @@
       <w:tr>
         <w:tc>
           <w:tcPr>
-            <w:tcW w:type="dxa" w:w="4320"/>
+            <w:tcW w:type="dxa" w:w="4680"/>
           </w:tcPr>
           <w:p>
             <w:r/>
@@ -1221,7 +1263,7 @@
         </w:tc>
         <w:tc>
           <w:tcPr>
-            <w:tcW w:type="dxa" w:w="4320"/>
+            <w:tcW w:type="dxa" w:w="4680"/>
           </w:tcPr>
           <w:p>
             <w:r/>
@@ -1234,7 +1276,7 @@
       <w:tr>
         <w:tc>
           <w:tcPr>
-            <w:tcW w:type="dxa" w:w="4320"/>
+            <w:tcW w:type="dxa" w:w="4680"/>
           </w:tcPr>
           <w:p>
             <w:r/>
@@ -1248,7 +1290,7 @@
         </w:tc>
         <w:tc>
           <w:tcPr>
-            <w:tcW w:type="dxa" w:w="4320"/>
+            <w:tcW w:type="dxa" w:w="4680"/>
           </w:tcPr>
           <w:p>
             <w:r/>
@@ -1261,7 +1303,7 @@
       <w:tr>
         <w:tc>
           <w:tcPr>
-            <w:tcW w:type="dxa" w:w="4320"/>
+            <w:tcW w:type="dxa" w:w="4680"/>
           </w:tcPr>
           <w:p>
             <w:r/>
@@ -1275,7 +1317,7 @@
         </w:tc>
         <w:tc>
           <w:tcPr>
-            <w:tcW w:type="dxa" w:w="4320"/>
+            <w:tcW w:type="dxa" w:w="4680"/>
           </w:tcPr>
           <w:p>
             <w:r/>
@@ -1297,7 +1339,7 @@
       <w:tr>
         <w:tc>
           <w:tcPr>
-            <w:tcW w:type="dxa" w:w="4320"/>
+            <w:tcW w:type="dxa" w:w="4680"/>
           </w:tcPr>
           <w:p>
             <w:r/>
@@ -1311,7 +1353,7 @@
         </w:tc>
         <w:tc>
           <w:tcPr>
-            <w:tcW w:type="dxa" w:w="4320"/>
+            <w:tcW w:type="dxa" w:w="4680"/>
           </w:tcPr>
           <w:p>
             <w:r/>
@@ -1333,7 +1375,7 @@
       <w:tr>
         <w:tc>
           <w:tcPr>
-            <w:tcW w:type="dxa" w:w="4320"/>
+            <w:tcW w:type="dxa" w:w="4680"/>
           </w:tcPr>
           <w:p>
             <w:r/>
@@ -1347,7 +1389,7 @@
         </w:tc>
         <w:tc>
           <w:tcPr>
-            <w:tcW w:type="dxa" w:w="4320"/>
+            <w:tcW w:type="dxa" w:w="4680"/>
           </w:tcPr>
           <w:p>
             <w:r/>
@@ -1360,7 +1402,7 @@
       <w:tr>
         <w:tc>
           <w:tcPr>
-            <w:tcW w:type="dxa" w:w="4320"/>
+            <w:tcW w:type="dxa" w:w="4680"/>
           </w:tcPr>
           <w:p>
             <w:r/>
@@ -1374,7 +1416,7 @@
         </w:tc>
         <w:tc>
           <w:tcPr>
-            <w:tcW w:type="dxa" w:w="4320"/>
+            <w:tcW w:type="dxa" w:w="4680"/>
           </w:tcPr>
           <w:p>
             <w:r/>
@@ -1387,7 +1429,7 @@
       <w:tr>
         <w:tc>
           <w:tcPr>
-            <w:tcW w:type="dxa" w:w="4320"/>
+            <w:tcW w:type="dxa" w:w="4680"/>
           </w:tcPr>
           <w:p>
             <w:r/>
@@ -1401,7 +1443,7 @@
         </w:tc>
         <w:tc>
           <w:tcPr>
-            <w:tcW w:type="dxa" w:w="4320"/>
+            <w:tcW w:type="dxa" w:w="4680"/>
           </w:tcPr>
           <w:p>
             <w:r/>
@@ -1415,13 +1457,13 @@
     <w:p/>
     <w:p>
       <w:pPr>
-        <w:spacing w:before="80" w:after="80"/>
+        <w:spacing w:before="60" w:after="60"/>
       </w:pPr>
       <w:r>
         <w:rPr>
-          <w:color w:val="CCCCCC"/>
+          <w:color w:val="BBBBBB"/>
         </w:rPr>
-        <w:t>__________________________________________________</w:t>
+        <w:t>____________________________________________________________</w:t>
       </w:r>
     </w:p>
     <w:p>
@@ -1432,7 +1474,7 @@
         <w:rPr>
           <w:b/>
           <w:color w:val="C41E3A"/>
-          <w:sz w:val="30"/>
+          <w:sz w:val="29"/>
         </w:rPr>
         <w:t>6. Protección de datos y cumplimiento normativo</w:t>
       </w:r>
@@ -1585,19 +1627,22 @@
       </w:r>
     </w:p>
     <w:p>
+      <w:pPr>
+        <w:jc w:val="both"/>
+      </w:pPr>
       <w:r>
         <w:t>En el documento de recomendaciones que acompaña a este proyecto se proponen, además, las acciones para formalizar el cumplimiento (registro de la actividad, evaluación de impacto si la Dirección lo considera, y política de privacidad explícita), que el Servicio asumiría con el apoyo del Delegado de Protección de Datos del centro.</w:t>
       </w:r>
     </w:p>
     <w:p>
       <w:pPr>
-        <w:spacing w:before="80" w:after="80"/>
+        <w:spacing w:before="60" w:after="60"/>
       </w:pPr>
       <w:r>
         <w:rPr>
-          <w:color w:val="CCCCCC"/>
+          <w:color w:val="BBBBBB"/>
         </w:rPr>
-        <w:t>__________________________________________________</w:t>
+        <w:t>____________________________________________________________</w:t>
       </w:r>
     </w:p>
     <w:p>
@@ -1608,7 +1653,7 @@
         <w:rPr>
           <w:b/>
           <w:color w:val="C41E3A"/>
-          <w:sz w:val="30"/>
+          <w:sz w:val="29"/>
         </w:rPr>
         <w:t>7. Seguridad informática y arquitectura</w:t>
       </w:r>
@@ -1702,19 +1747,22 @@
       </w:r>
     </w:p>
     <w:p>
+      <w:pPr>
+        <w:jc w:val="both"/>
+      </w:pPr>
       <w:r>
         <w:t>En el documento de recomendaciones se proponen mejoras concretas para reforzar la postura de seguridad (revisión de la telemetría/analítica, control de acceso a los PDF, política de credenciales y dependencia de servicios externos).</w:t>
       </w:r>
     </w:p>
     <w:p>
       <w:pPr>
-        <w:spacing w:before="80" w:after="80"/>
+        <w:spacing w:before="60" w:after="60"/>
       </w:pPr>
       <w:r>
         <w:rPr>
-          <w:color w:val="CCCCCC"/>
+          <w:color w:val="BBBBBB"/>
         </w:rPr>
-        <w:t>__________________________________________________</w:t>
+        <w:t>____________________________________________________________</w:t>
       </w:r>
     </w:p>
     <w:p>
@@ -1725,7 +1773,7 @@
         <w:rPr>
           <w:b/>
           <w:color w:val="C41E3A"/>
-          <w:sz w:val="30"/>
+          <w:sz w:val="29"/>
         </w:rPr>
         <w:t>8. Gobernanza, autoría y actualización del contenido</w:t>
       </w:r>
@@ -1823,6 +1871,9 @@
       </w:r>
     </w:p>
     <w:p>
+      <w:pPr>
+        <w:jc w:val="both"/>
+      </w:pPr>
       <w:r>
         <w:t xml:space="preserve">Se propone que, en caso de validación institucional, este modelo de gobernanza se formalice mediante un </w:t>
       </w:r>
@@ -1838,13 +1889,13 @@
     </w:p>
     <w:p>
       <w:pPr>
-        <w:spacing w:before="80" w:after="80"/>
+        <w:spacing w:before="60" w:after="60"/>
       </w:pPr>
       <w:r>
         <w:rPr>
-          <w:color w:val="CCCCCC"/>
+          <w:color w:val="BBBBBB"/>
         </w:rPr>
-        <w:t>__________________________________________________</w:t>
+        <w:t>____________________________________________________________</w:t>
       </w:r>
     </w:p>
     <w:p>
@@ -1855,12 +1906,15 @@
         <w:rPr>
           <w:b/>
           <w:color w:val="C41E3A"/>
-          <w:sz w:val="30"/>
+          <w:sz w:val="29"/>
         </w:rPr>
         <w:t>9. Beneficios esperados e indicadores propuestos</w:t>
       </w:r>
     </w:p>
     <w:p>
+      <w:pPr>
+        <w:jc w:val="both"/>
+      </w:pPr>
       <w:r>
         <w:rPr>
           <w:b/>
@@ -1872,6 +1926,9 @@
       </w:r>
     </w:p>
     <w:p>
+      <w:pPr>
+        <w:jc w:val="both"/>
+      </w:pPr>
       <w:r>
         <w:rPr>
           <w:b/>
@@ -1924,13 +1981,13 @@
     </w:p>
     <w:p>
       <w:pPr>
-        <w:spacing w:before="80" w:after="80"/>
+        <w:spacing w:before="60" w:after="60"/>
       </w:pPr>
       <w:r>
         <w:rPr>
-          <w:color w:val="CCCCCC"/>
+          <w:color w:val="BBBBBB"/>
         </w:rPr>
-        <w:t>__________________________________________________</w:t>
+        <w:t>____________________________________________________________</w:t>
       </w:r>
     </w:p>
     <w:p>
@@ -1941,7 +1998,7 @@
         <w:rPr>
           <w:b/>
           <w:color w:val="C41E3A"/>
-          <w:sz w:val="30"/>
+          <w:sz w:val="29"/>
         </w:rPr>
         <w:t>10. Plan de implantación propuesto</w:t>
       </w:r>
@@ -2004,13 +2061,13 @@
     </w:p>
     <w:p>
       <w:pPr>
-        <w:spacing w:before="80" w:after="80"/>
+        <w:spacing w:before="60" w:after="60"/>
       </w:pPr>
       <w:r>
         <w:rPr>
-          <w:color w:val="CCCCCC"/>
+          <w:color w:val="BBBBBB"/>
         </w:rPr>
-        <w:t>__________________________________________________</w:t>
+        <w:t>____________________________________________________________</w:t>
       </w:r>
     </w:p>
     <w:p>
@@ -2021,7 +2078,7 @@
         <w:rPr>
           <w:b/>
           <w:color w:val="C41E3A"/>
-          <w:sz w:val="30"/>
+          <w:sz w:val="29"/>
         </w:rPr>
         <w:t>11. Limitación de responsabilidad (texto vigente en la aplicación)</w:t>
       </w:r>
@@ -2047,13 +2104,13 @@
     </w:p>
     <w:p>
       <w:pPr>
-        <w:spacing w:before="80" w:after="80"/>
+        <w:spacing w:before="60" w:after="60"/>
       </w:pPr>
       <w:r>
         <w:rPr>
-          <w:color w:val="CCCCCC"/>
+          <w:color w:val="BBBBBB"/>
         </w:rPr>
-        <w:t>__________________________________________________</w:t>
+        <w:t>____________________________________________________________</w:t>
       </w:r>
     </w:p>
     <w:p>
@@ -2064,7 +2121,7 @@
         <w:rPr>
           <w:b/>
           <w:color w:val="C41E3A"/>
-          <w:sz w:val="30"/>
+          <w:sz w:val="29"/>
         </w:rPr>
         <w:t>12. Anexos</w:t>
       </w:r>
@@ -2137,16 +2194,19 @@
     </w:p>
     <w:p>
       <w:pPr>
-        <w:spacing w:before="80" w:after="80"/>
+        <w:spacing w:before="60" w:after="60"/>
       </w:pPr>
       <w:r>
         <w:rPr>
-          <w:color w:val="CCCCCC"/>
+          <w:color w:val="BBBBBB"/>
         </w:rPr>
-        <w:t>__________________________________________________</w:t>
+        <w:t>____________________________________________________________</w:t>
       </w:r>
     </w:p>
     <w:p>
+      <w:pPr>
+        <w:jc w:val="both"/>
+      </w:pPr>
       <w:r>
         <w:rPr>
           <w:i/>
@@ -2155,13 +2215,53 @@
       </w:r>
     </w:p>
     <w:sectPr>
+      <w:footerReference w:type="default" r:id="rId9"/>
       <w:pgSz w:w="12240" w:h="15840"/>
-      <w:pgMar w:top="1440" w:right="1800" w:bottom="1440" w:left="1800" w:header="720" w:footer="720" w:gutter="0"/>
+      <w:pgMar w:top="1296" w:right="1440" w:bottom="1296" w:left="1440" w:header="720" w:footer="720" w:gutter="0"/>
       <w:cols w:space="720"/>
       <w:docGrid w:linePitch="360"/>
     </w:sectPr>
   </w:body>
 </w:document>
+</file>
+
+<file path=word/footer1.xml><?xml version="1.0" encoding="utf-8"?>
+<w:ftr xmlns:m="http://schemas.openxmlformats.org/officeDocument/2006/math" xmlns:mc="http://schemas.openxmlformats.org/markup-compatibility/2006" xmlns:mo="http://schemas.microsoft.com/office/mac/office/2008/main" xmlns:mv="urn:schemas-microsoft-com:mac:vml" xmlns:o="urn:schemas-microsoft-com:office:office" xmlns:r="http://schemas.openxmlformats.org/officeDocument/2006/relationships" xmlns:v="urn:schemas-microsoft-com:vml" xmlns:w10="urn:schemas-microsoft-com:office:word" xmlns:w14="http://schemas.microsoft.com/office/word/2010/wordml" xmlns:w="http://schemas.openxmlformats.org/wordprocessingml/2006/main" xmlns:wne="http://schemas.microsoft.com/office/word/2006/wordml" xmlns:wp14="http://schemas.microsoft.com/office/word/2010/wordprocessingDrawing" xmlns:wp="http://schemas.openxmlformats.org/drawingml/2006/wordprocessingDrawing" xmlns:wpc="http://schemas.microsoft.com/office/word/2010/wordprocessingCanvas" xmlns:wpg="http://schemas.microsoft.com/office/word/2010/wordprocessingGroup" xmlns:wpi="http://schemas.microsoft.com/office/word/2010/wordprocessingInk" xmlns:wps="http://schemas.microsoft.com/office/word/2010/wordprocessingShape" mc:Ignorable="w14 wp14">
+  <w:p>
+    <w:pPr>
+      <w:pStyle w:val="Footer"/>
+      <w:jc w:val="center"/>
+    </w:pPr>
+    <w:r>
+      <w:rPr>
+        <w:color w:val="666666"/>
+        <w:sz w:val="16"/>
+      </w:rPr>
+      <w:t xml:space="preserve">HemoPocket · Memoria del proyecto   ·   Página </w:t>
+    </w:r>
+    <w:fldSimple w:instr="PAGE">
+      <w:r>
+        <w:rPr>
+          <w:sz w:val="16"/>
+        </w:rPr>
+      </w:r>
+    </w:fldSimple>
+    <w:r>
+      <w:rPr>
+        <w:color w:val="666666"/>
+        <w:sz w:val="16"/>
+      </w:rPr>
+      <w:t xml:space="preserve"> de </w:t>
+    </w:r>
+    <w:fldSimple w:instr="NUMPAGES">
+      <w:r>
+        <w:rPr>
+          <w:sz w:val="16"/>
+        </w:rPr>
+      </w:r>
+    </w:fldSimple>
+  </w:p>
+</w:ftr>
 </file>
 
 <file path=word/numbering.xml><?xml version="1.0" encoding="utf-8"?>

</xml_diff>